<commit_message>
Revision round A: reframe scope, region-level frame cost, exploratory analyses marked, terms defined, references added, Springer section order
</commit_message>
<xml_diff>
--- a/paper/submission/supplementary_material.docx
+++ b/paper/submission/supplementary_material.docx
@@ -15,7 +15,7 @@
         <w:pStyle w:val="Subtitle"/>
       </w:pPr>
       <w:r>
-        <w:t xml:space="preserve">Evaluation geometry and the limits of cross-region transfer in pre-fire thermal wildfire prediction</w:t>
+        <w:t xml:space="preserve">Evaluation area and the limits of cross-region transfer of pre-fire thermal wildfire models: five large Mediterranean fires</w:t>
       </w:r>
     </w:p>
     <w:p>
@@ -33,21 +33,7 @@
           <w:i/>
           <w:iCs/>
         </w:rPr>
-        <w:t xml:space="preserve">Evaluation geometry and the limits of cross-region transfer in pre-fire</w:t>
-      </w:r>
-      <w:r>
-        <w:rPr>
-          <w:i/>
-          <w:iCs/>
-        </w:rPr>
-        <w:t xml:space="preserve"> </w:t>
-      </w:r>
-      <w:r>
-        <w:rPr>
-          <w:i/>
-          <w:iCs/>
-        </w:rPr>
-        <w:t xml:space="preserve">thermal wildfire prediction</w:t>
+        <w:t xml:space="preserve">Evaluation area and the limits of cross-region transfer of pre-fire thermal wildfire models: five large Mediterranean fires</w:t>
       </w:r>
       <w:r>
         <w:t xml:space="preserve">.</w:t>
@@ -64,13 +50,13 @@
         <w:t xml:space="preserve"> </w:t>
       </w:r>
       <w:r>
-        <w:t xml:space="preserve">supporting tables, Section S3 the protocol details and limitations, Section S5 the target-label</w:t>
-      </w:r>
-      <w:r>
-        <w:t xml:space="preserve"> </w:t>
-      </w:r>
-      <w:r>
-        <w:t xml:space="preserve">recovery curve, Section S6 the code and Section S7 the data. Tables are numbered S1 to S34,</w:t>
+        <w:t xml:space="preserve">supporting tables, Section S3 the protocol details and limitations, Section S4 the target-label</w:t>
+      </w:r>
+      <w:r>
+        <w:t xml:space="preserve"> </w:t>
+      </w:r>
+      <w:r>
+        <w:t xml:space="preserve">recovery curve, Section S5 the code and Section S6 the data. Tables are numbered S1 to S34,</w:t>
       </w:r>
       <w:r>
         <w:t xml:space="preserve"> </w:t>
@@ -381,7 +367,7 @@
         </w:numPr>
       </w:pPr>
       <w:r>
-        <w:t xml:space="preserve">S1.20 The frame test, elaborated</w:t>
+        <w:t xml:space="preserve">S1.19 The frame test, elaborated</w:t>
       </w:r>
     </w:p>
     <w:p>
@@ -393,7 +379,7 @@
         </w:numPr>
       </w:pPr>
       <w:r>
-        <w:t xml:space="preserve">S1.21 The transfer matrix and adaptation, elaborated</w:t>
+        <w:t xml:space="preserve">S1.20 The transfer matrix and adaptation, elaborated</w:t>
       </w:r>
     </w:p>
     <w:p>
@@ -405,7 +391,7 @@
         </w:numPr>
       </w:pPr>
       <w:r>
-        <w:t xml:space="preserve">S1.22 The similarity diagnostics</w:t>
+        <w:t xml:space="preserve">S1.21 The similarity diagnostics</w:t>
       </w:r>
     </w:p>
     <w:p>
@@ -417,7 +403,7 @@
         </w:numPr>
       </w:pPr>
       <w:r>
-        <w:t xml:space="preserve">S1.23 Additional robustness analyses</w:t>
+        <w:t xml:space="preserve">S1.22 Additional robustness analyses</w:t>
       </w:r>
     </w:p>
     <w:p>
@@ -453,7 +439,7 @@
         </w:numPr>
       </w:pPr>
       <w:r>
-        <w:t xml:space="preserve">S5 Target-label recovery curve</w:t>
+        <w:t xml:space="preserve">S4 Target-label recovery curve</w:t>
       </w:r>
     </w:p>
     <w:p>
@@ -465,7 +451,7 @@
         </w:numPr>
       </w:pPr>
       <w:r>
-        <w:t xml:space="preserve">S6 Code</w:t>
+        <w:t xml:space="preserve">S5 Code</w:t>
       </w:r>
     </w:p>
     <w:p>
@@ -477,15 +463,7 @@
         </w:numPr>
       </w:pPr>
       <w:r>
-        <w:t xml:space="preserve">S7 Data</w:t>
-      </w:r>
-    </w:p>
-    <w:p>
-      <w:pPr>
-        <w:pStyle w:val="FirstParagraph"/>
-      </w:pPr>
-      <w:r>
-        <w:t xml:space="preserve">The section numbers S1.19 and S4 are not used.</w:t>
+        <w:t xml:space="preserve">S6 Data</w:t>
       </w:r>
     </w:p>
     <w:bookmarkEnd w:id="19"/>
@@ -5271,13 +5249,13 @@
         <w:t xml:space="preserve"> </w:t>
       </w:r>
       <w:r>
-        <w:t xml:space="preserve">minus scar area at 5 km is +0.074 [−0.009, +0.157] at scar level and [+0.034, +0.146] with a</w:t>
-      </w:r>
-      <w:r>
-        <w:t xml:space="preserve"> </w:t>
-      </w:r>
-      <w:r>
-        <w:t xml:space="preserve">region-cluster bootstrap. The within-region half-split gives +0.028, positive in 13 of 18 splits</w:t>
+        <w:t xml:space="preserve">minus scar area at 5 km is +0.074 [−0.009, +0.157] at scar level. With only three regions, no</w:t>
+      </w:r>
+      <w:r>
+        <w:t xml:space="preserve"> </w:t>
+      </w:r>
+      <w:r>
+        <w:t xml:space="preserve">reliable region-level interval can be given for this difference. The within-region half-split gives +0.028, positive in 13 of 18 splits</w:t>
       </w:r>
       <w:r>
         <w:t xml:space="preserve"> </w:t>
@@ -15869,7 +15847,7 @@
         <w:t xml:space="preserve"> </w:t>
       </w:r>
       <w:r>
-        <w:t xml:space="preserve">also requires the association in each region to be significant, none remains (Section S1.20). The</w:t>
+        <w:t xml:space="preserve">also requires the association in each region to be significant, none remains (Section S1.19). The</w:t>
       </w:r>
       <w:r>
         <w:t xml:space="preserve"> </w:t>
@@ -17526,7 +17504,7 @@
         <w:t xml:space="preserve"> </w:t>
       </w:r>
       <w:r>
-        <w:t xml:space="preserve">correction (Section S1.20). The LST anomaly differs between regions only under the weaker difference</w:t>
+        <w:t xml:space="preserve">correction (Section S1.19). The LST anomaly differs between regions only under the weaker difference</w:t>
       </w:r>
       <w:r>
         <w:t xml:space="preserve"> </w:t>
@@ -18509,7 +18487,7 @@
         <w:t xml:space="preserve"> </w:t>
       </w:r>
       <w:r>
-        <w:t xml:space="preserve">correlation across pairs; that is tested in Section S1.22.</w:t>
+        <w:t xml:space="preserve">correlation across pairs; that is tested in Section S1.21.</w:t>
       </w:r>
     </w:p>
     <w:bookmarkEnd w:id="38"/>
@@ -19344,13 +19322,13 @@
       </w:r>
     </w:p>
     <w:bookmarkEnd w:id="40"/>
-    <w:bookmarkStart w:id="41" w:name="s1.20-the-frame-test-elaborated"/>
+    <w:bookmarkStart w:id="41" w:name="s1.19-the-frame-test-elaborated"/>
     <w:p>
       <w:pPr>
         <w:pStyle w:val="Heading2"/>
       </w:pPr>
       <w:r>
-        <w:t xml:space="preserve">S1.20 The frame test, elaborated</w:t>
+        <w:t xml:space="preserve">S1.19 The frame test, elaborated</w:t>
       </w:r>
     </w:p>
     <w:p>
@@ -21551,13 +21529,13 @@
       </w:r>
     </w:p>
     <w:bookmarkEnd w:id="41"/>
-    <w:bookmarkStart w:id="42" w:name="X0d2c9aa811e4f07caad7408449c80709d8dca4c"/>
+    <w:bookmarkStart w:id="42" w:name="Xa3faaca28a905e0cb5490e9d0fd4b7cd085d410"/>
     <w:p>
       <w:pPr>
         <w:pStyle w:val="Heading2"/>
       </w:pPr>
       <w:r>
-        <w:t xml:space="preserve">S1.21 The transfer matrix and adaptation, elaborated</w:t>
+        <w:t xml:space="preserve">S1.20 The transfer matrix and adaptation, elaborated</w:t>
       </w:r>
     </w:p>
     <w:p>
@@ -21643,7 +21621,7 @@
           <w:b/>
           <w:bCs/>
         </w:rPr>
-        <w:t xml:space="preserve">Label-blind adaptation.</w:t>
+        <w:t xml:space="preserve">Label-free adaptation.</w:t>
       </w:r>
       <w:r>
         <w:t xml:space="preserve"> </w:t>
@@ -21791,13 +21769,13 @@
       </w:r>
     </w:p>
     <w:bookmarkEnd w:id="42"/>
-    <w:bookmarkStart w:id="43" w:name="s1.22-the-similarity-diagnostics"/>
+    <w:bookmarkStart w:id="43" w:name="s1.21-the-similarity-diagnostics"/>
     <w:p>
       <w:pPr>
         <w:pStyle w:val="Heading2"/>
       </w:pPr>
       <w:r>
-        <w:t xml:space="preserve">S1.22 The similarity diagnostics</w:t>
+        <w:t xml:space="preserve">S1.21 The similarity diagnostics</w:t>
       </w:r>
     </w:p>
     <w:p>
@@ -22006,7 +21984,7 @@
         <w:t xml:space="preserve"> </w:t>
       </w:r>
       <w:r>
-        <w:t xml:space="preserve">Section S1.20 gives the two measures recomputed on the collar. One of them, the</w:t>
+        <w:t xml:space="preserve">Section S1.19 gives the two measures recomputed on the collar. One of them, the</w:t>
       </w:r>
       <w:r>
         <w:t xml:space="preserve"> </w:t>
@@ -22064,13 +22042,13 @@
       </w:r>
     </w:p>
     <w:bookmarkEnd w:id="43"/>
-    <w:bookmarkStart w:id="44" w:name="s1.23-additional-robustness-analyses"/>
+    <w:bookmarkStart w:id="44" w:name="s1.22-additional-robustness-analyses"/>
     <w:p>
       <w:pPr>
         <w:pStyle w:val="Heading2"/>
       </w:pPr>
       <w:r>
-        <w:t xml:space="preserve">S1.23 Additional robustness analyses</w:t>
+        <w:t xml:space="preserve">S1.22 Additional robustness analyses</w:t>
       </w:r>
     </w:p>
     <w:p>
@@ -22167,9 +22145,9 @@
         <w:tblLook w:firstRow="1" w:lastRow="0" w:firstColumn="0" w:lastColumn="0" w:noHBand="0" w:noVBand="0" w:val="0020"/>
       </w:tblPr>
       <w:tblGrid>
-        <w:gridCol w:w="752"/>
-        <w:gridCol w:w="1382"/>
-        <w:gridCol w:w="6936"/>
+        <w:gridCol w:w="1137"/>
+        <w:gridCol w:w="1432"/>
+        <w:gridCol w:w="6501"/>
       </w:tblGrid>
       <w:tr>
         <w:trPr>
@@ -22178,7 +22156,7 @@
         </w:trPr>
         <w:tc>
           <w:tcPr>
-            <w:tcW w:type="dxa" w:w="752"/>
+            <w:tcW w:type="dxa" w:w="1137"/>
           </w:tcPr>
           <w:p>
             <w:pPr>
@@ -22195,7 +22173,7 @@
         </w:tc>
         <w:tc>
           <w:tcPr>
-            <w:tcW w:type="dxa" w:w="1382"/>
+            <w:tcW w:type="dxa" w:w="1432"/>
           </w:tcPr>
           <w:p>
             <w:pPr>
@@ -22212,7 +22190,7 @@
         </w:tc>
         <w:tc>
           <w:tcPr>
-            <w:tcW w:type="dxa" w:w="6936"/>
+            <w:tcW w:type="dxa" w:w="6501"/>
           </w:tcPr>
           <w:p>
             <w:pPr>
@@ -22234,7 +22212,7 @@
         </w:trPr>
         <w:tc>
           <w:tcPr>
-            <w:tcW w:type="dxa" w:w="752"/>
+            <w:tcW w:type="dxa" w:w="1137"/>
           </w:tcPr>
           <w:p>
             <w:pPr>
@@ -22251,7 +22229,7 @@
         </w:tc>
         <w:tc>
           <w:tcPr>
-            <w:tcW w:type="dxa" w:w="1382"/>
+            <w:tcW w:type="dxa" w:w="1432"/>
           </w:tcPr>
           <w:p>
             <w:pPr>
@@ -22268,7 +22246,7 @@
         </w:tc>
         <w:tc>
           <w:tcPr>
-            <w:tcW w:type="dxa" w:w="6936"/>
+            <w:tcW w:type="dxa" w:w="6501"/>
           </w:tcPr>
           <w:p>
             <w:pPr>
@@ -22290,7 +22268,7 @@
         </w:trPr>
         <w:tc>
           <w:tcPr>
-            <w:tcW w:type="dxa" w:w="752"/>
+            <w:tcW w:type="dxa" w:w="1137"/>
           </w:tcPr>
           <w:p>
             <w:pPr>
@@ -22307,7 +22285,7 @@
         </w:tc>
         <w:tc>
           <w:tcPr>
-            <w:tcW w:type="dxa" w:w="1382"/>
+            <w:tcW w:type="dxa" w:w="1432"/>
           </w:tcPr>
           <w:p>
             <w:pPr>
@@ -22324,7 +22302,7 @@
         </w:tc>
         <w:tc>
           <w:tcPr>
-            <w:tcW w:type="dxa" w:w="6936"/>
+            <w:tcW w:type="dxa" w:w="6501"/>
           </w:tcPr>
           <w:p>
             <w:pPr>
@@ -22346,70 +22324,52 @@
         </w:trPr>
         <w:tc>
           <w:tcPr>
-            <w:tcW w:type="dxa" w:w="752"/>
-          </w:tcPr>
-          <w:p>
-            <w:pPr>
-              <w:pStyle w:val="Compact"/>
-              <w:spacing w:line="240" w:lineRule="auto" w:after="20"/>
-            </w:pPr>
-            <w:r>
-              <w:rPr>
-                <w:sz w:val="20"/>
-              </w:rPr>
-              <w:t xml:space="preserve">Label-free target frames (a4)</w:t>
-            </w:r>
-          </w:p>
-        </w:tc>
-        <w:tc>
-          <w:tcPr>
-            <w:tcW w:type="dxa" w:w="1382"/>
-          </w:tcPr>
-          <w:p>
-            <w:pPr>
-              <w:pStyle w:val="Compact"/>
-              <w:spacing w:line="240" w:lineRule="auto" w:after="20"/>
-            </w:pPr>
-            <w:r>
-              <w:rPr>
-                <w:sz w:val="20"/>
-              </w:rPr>
-              <w:t xml:space="preserve">Does a frame drawn without target labels change transfer?</w:t>
-            </w:r>
-          </w:p>
-        </w:tc>
-        <w:tc>
-          <w:tcPr>
-            <w:tcW w:type="dxa" w:w="6936"/>
-          </w:tcPr>
-          <w:p>
-            <w:pPr>
-              <w:pStyle w:val="Compact"/>
-              <w:spacing w:line="240" w:lineRule="auto" w:after="20"/>
-            </w:pPr>
-            <w:r>
-              <w:rPr>
-                <w:sz w:val="20"/>
-              </w:rPr>
-              <w:t xml:space="preserve">Trimming the target to the source’s per-feature range, or to the source’s area of applicability</w:t>
-            </w:r>
-            <w:r>
-              <w:rPr>
-                <w:sz w:val="20"/>
-              </w:rPr>
-              <w:t xml:space="preserve"> </w:t>
-            </w:r>
-            <w:r>
-              <w:rPr>
-                <w:sz w:val="20"/>
-              </w:rPr>
-              <w:t xml:space="preserve">(Meyer and Pebesma 2021)</w:t>
-            </w:r>
-            <w:r>
-              <w:rPr>
-                <w:sz w:val="20"/>
-              </w:rPr>
-              <w:t xml:space="preserve">, gives means of 0.520 to 0.574, and a 20 km window 0.482; every paired thermal Δ interval spans zero</w:t>
+            <w:tcW w:type="dxa" w:w="1137"/>
+          </w:tcPr>
+          <w:p>
+            <w:pPr>
+              <w:pStyle w:val="Compact"/>
+              <w:spacing w:line="240" w:lineRule="auto" w:after="20"/>
+            </w:pPr>
+            <w:r>
+              <w:rPr>
+                <w:sz w:val="20"/>
+              </w:rPr>
+              <w:t xml:space="preserve">Frame cost against the share of distant cells (a3)</w:t>
+            </w:r>
+          </w:p>
+        </w:tc>
+        <w:tc>
+          <w:tcPr>
+            <w:tcW w:type="dxa" w:w="1432"/>
+          </w:tcPr>
+          <w:p>
+            <w:pPr>
+              <w:pStyle w:val="Compact"/>
+              <w:spacing w:line="240" w:lineRule="auto" w:after="20"/>
+            </w:pPr>
+            <w:r>
+              <w:rPr>
+                <w:sz w:val="20"/>
+              </w:rPr>
+              <w:t xml:space="preserve">Is the cost larger where the study area has more distant cells?</w:t>
+            </w:r>
+          </w:p>
+        </w:tc>
+        <w:tc>
+          <w:tcPr>
+            <w:tcW w:type="dxa" w:w="6501"/>
+          </w:tcPr>
+          <w:p>
+            <w:pPr>
+              <w:pStyle w:val="Compact"/>
+              <w:spacing w:line="240" w:lineRule="auto" w:after="20"/>
+            </w:pPr>
+            <w:r>
+              <w:rPr>
+                <w:sz w:val="20"/>
+              </w:rPr>
+              <w:t xml:space="preserve">No. Region-level slope 0.005 [−0.41, +0.42], r = 0.02 (n = 5); scar-level slope −0.049 [−0.34, +0.24] (n = 9, scars not independent). The test has little power</w:t>
             </w:r>
           </w:p>
         </w:tc>
@@ -22420,52 +22380,70 @@
         </w:trPr>
         <w:tc>
           <w:tcPr>
-            <w:tcW w:type="dxa" w:w="752"/>
-          </w:tcPr>
-          <w:p>
-            <w:pPr>
-              <w:pStyle w:val="Compact"/>
-              <w:spacing w:line="240" w:lineRule="auto" w:after="20"/>
-            </w:pPr>
-            <w:r>
-              <w:rPr>
-                <w:sz w:val="20"/>
-              </w:rPr>
-              <w:t xml:space="preserve">Metric dependence (a5)</w:t>
-            </w:r>
-          </w:p>
-        </w:tc>
-        <w:tc>
-          <w:tcPr>
-            <w:tcW w:type="dxa" w:w="1382"/>
-          </w:tcPr>
-          <w:p>
-            <w:pPr>
-              <w:pStyle w:val="Compact"/>
-              <w:spacing w:line="240" w:lineRule="auto" w:after="20"/>
-            </w:pPr>
-            <w:r>
-              <w:rPr>
-                <w:sz w:val="20"/>
-              </w:rPr>
-              <w:t xml:space="preserve">Is the frame cost specific to ROC-AUC?</w:t>
-            </w:r>
-          </w:p>
-        </w:tc>
-        <w:tc>
-          <w:tcPr>
-            <w:tcW w:type="dxa" w:w="6936"/>
-          </w:tcPr>
-          <w:p>
-            <w:pPr>
-              <w:pStyle w:val="Compact"/>
-              <w:spacing w:line="240" w:lineRule="auto" w:after="20"/>
-            </w:pPr>
-            <w:r>
-              <w:rPr>
-                <w:sz w:val="20"/>
-              </w:rPr>
-              <w:t xml:space="preserve">Region-wide minus scar-frame over nine scars: partial AUC (FPR ≤ 0.1) 0.088 [0.048, 0.128]; average precision −0.342 [−0.477, −0.206], higher on the scar frame because its prevalence is higher</w:t>
+            <w:tcW w:type="dxa" w:w="1137"/>
+          </w:tcPr>
+          <w:p>
+            <w:pPr>
+              <w:pStyle w:val="Compact"/>
+              <w:spacing w:line="240" w:lineRule="auto" w:after="20"/>
+            </w:pPr>
+            <w:r>
+              <w:rPr>
+                <w:sz w:val="20"/>
+              </w:rPr>
+              <w:t xml:space="preserve">Label-free target frames (a4)</w:t>
+            </w:r>
+          </w:p>
+        </w:tc>
+        <w:tc>
+          <w:tcPr>
+            <w:tcW w:type="dxa" w:w="1432"/>
+          </w:tcPr>
+          <w:p>
+            <w:pPr>
+              <w:pStyle w:val="Compact"/>
+              <w:spacing w:line="240" w:lineRule="auto" w:after="20"/>
+            </w:pPr>
+            <w:r>
+              <w:rPr>
+                <w:sz w:val="20"/>
+              </w:rPr>
+              <w:t xml:space="preserve">Does a frame drawn without target labels change transfer?</w:t>
+            </w:r>
+          </w:p>
+        </w:tc>
+        <w:tc>
+          <w:tcPr>
+            <w:tcW w:type="dxa" w:w="6501"/>
+          </w:tcPr>
+          <w:p>
+            <w:pPr>
+              <w:pStyle w:val="Compact"/>
+              <w:spacing w:line="240" w:lineRule="auto" w:after="20"/>
+            </w:pPr>
+            <w:r>
+              <w:rPr>
+                <w:sz w:val="20"/>
+              </w:rPr>
+              <w:t xml:space="preserve">Trimming the target to the source’s per-feature range, or to the source’s area of applicability</w:t>
+            </w:r>
+            <w:r>
+              <w:rPr>
+                <w:sz w:val="20"/>
+              </w:rPr>
+              <w:t xml:space="preserve"> </w:t>
+            </w:r>
+            <w:r>
+              <w:rPr>
+                <w:sz w:val="20"/>
+              </w:rPr>
+              <w:t xml:space="preserve">(Meyer and Pebesma 2021)</w:t>
+            </w:r>
+            <w:r>
+              <w:rPr>
+                <w:sz w:val="20"/>
+              </w:rPr>
+              <w:t xml:space="preserve">, gives means of 0.520 to 0.574, and a 20 km window 0.482; every paired thermal Δ interval spans zero</w:t>
             </w:r>
           </w:p>
         </w:tc>
@@ -22476,72 +22454,52 @@
         </w:trPr>
         <w:tc>
           <w:tcPr>
-            <w:tcW w:type="dxa" w:w="752"/>
-          </w:tcPr>
-          <w:p>
-            <w:pPr>
-              <w:pStyle w:val="Compact"/>
-              <w:spacing w:line="240" w:lineRule="auto" w:after="20"/>
-            </w:pPr>
-            <w:r>
-              <w:rPr>
-                <w:sz w:val="20"/>
-              </w:rPr>
-              <w:t xml:space="preserve">Collar within-region increment</w:t>
-            </w:r>
-          </w:p>
-        </w:tc>
-        <w:tc>
-          <w:tcPr>
-            <w:tcW w:type="dxa" w:w="1382"/>
-          </w:tcPr>
-          <w:p>
-            <w:pPr>
-              <w:pStyle w:val="Compact"/>
-              <w:spacing w:line="240" w:lineRule="auto" w:after="20"/>
-            </w:pPr>
-            <w:r>
-              <w:rPr>
-                <w:sz w:val="20"/>
-              </w:rPr>
-              <w:t xml:space="preserve">Does the within-region increment survive the collar?</w:t>
-            </w:r>
-          </w:p>
-        </w:tc>
-        <w:tc>
-          <w:tcPr>
-            <w:tcW w:type="dxa" w:w="6936"/>
-          </w:tcPr>
-          <w:p>
-            <w:pPr>
-              <w:pStyle w:val="Compact"/>
-              <w:spacing w:line="240" w:lineRule="auto" w:after="20"/>
-            </w:pPr>
-            <w:r>
-              <w:rPr>
-                <w:sz w:val="20"/>
-              </w:rPr>
-              <w:t xml:space="preserve">+0.083 [+0.037, +0.129] over five regions (Student</w:t>
-            </w:r>
-            <w:r>
-              <w:rPr>
-                <w:sz w:val="20"/>
-              </w:rPr>
-              <w:t xml:space="preserve"> </w:t>
-            </w:r>
-            <w:r>
-              <w:rPr>
-                <w:i/>
-                <w:iCs/>
-                <w:sz w:val="20"/>
-              </w:rPr>
-              <w:t xml:space="preserve">t</w:t>
-            </w:r>
-            <w:r>
-              <w:rPr>
-                <w:sz w:val="20"/>
-              </w:rPr>
-              <w:t xml:space="preserve">), against +0.087 [+0.037, +0.136] as drawn</w:t>
+            <w:tcW w:type="dxa" w:w="1137"/>
+          </w:tcPr>
+          <w:p>
+            <w:pPr>
+              <w:pStyle w:val="Compact"/>
+              <w:spacing w:line="240" w:lineRule="auto" w:after="20"/>
+            </w:pPr>
+            <w:r>
+              <w:rPr>
+                <w:sz w:val="20"/>
+              </w:rPr>
+              <w:t xml:space="preserve">Metric dependence (a5)</w:t>
+            </w:r>
+          </w:p>
+        </w:tc>
+        <w:tc>
+          <w:tcPr>
+            <w:tcW w:type="dxa" w:w="1432"/>
+          </w:tcPr>
+          <w:p>
+            <w:pPr>
+              <w:pStyle w:val="Compact"/>
+              <w:spacing w:line="240" w:lineRule="auto" w:after="20"/>
+            </w:pPr>
+            <w:r>
+              <w:rPr>
+                <w:sz w:val="20"/>
+              </w:rPr>
+              <w:t xml:space="preserve">Is the frame cost specific to ROC-AUC?</w:t>
+            </w:r>
+          </w:p>
+        </w:tc>
+        <w:tc>
+          <w:tcPr>
+            <w:tcW w:type="dxa" w:w="6501"/>
+          </w:tcPr>
+          <w:p>
+            <w:pPr>
+              <w:pStyle w:val="Compact"/>
+              <w:spacing w:line="240" w:lineRule="auto" w:after="20"/>
+            </w:pPr>
+            <w:r>
+              <w:rPr>
+                <w:sz w:val="20"/>
+              </w:rPr>
+              <w:t xml:space="preserve">Region-wide minus scar-frame over nine scars: partial AUC (FPR ≤ 0.1) 0.088 [0.048, 0.128]; average precision −0.342 [−0.477, −0.206], higher on the scar frame because its prevalence is higher</w:t>
             </w:r>
           </w:p>
         </w:tc>
@@ -22552,52 +22510,72 @@
         </w:trPr>
         <w:tc>
           <w:tcPr>
-            <w:tcW w:type="dxa" w:w="752"/>
-          </w:tcPr>
-          <w:p>
-            <w:pPr>
-              <w:pStyle w:val="Compact"/>
-              <w:spacing w:line="240" w:lineRule="auto" w:after="20"/>
-            </w:pPr>
-            <w:r>
-              <w:rPr>
-                <w:sz w:val="20"/>
-              </w:rPr>
-              <w:t xml:space="preserve">Equalised Δ by resampling unit</w:t>
-            </w:r>
-          </w:p>
-        </w:tc>
-        <w:tc>
-          <w:tcPr>
-            <w:tcW w:type="dxa" w:w="1382"/>
-          </w:tcPr>
-          <w:p>
-            <w:pPr>
-              <w:pStyle w:val="Compact"/>
-              <w:spacing w:line="240" w:lineRule="auto" w:after="20"/>
-            </w:pPr>
-            <w:r>
-              <w:rPr>
-                <w:sz w:val="20"/>
-              </w:rPr>
-              <w:t xml:space="preserve">Does the collar Δ exclude zero?</w:t>
-            </w:r>
-          </w:p>
-        </w:tc>
-        <w:tc>
-          <w:tcPr>
-            <w:tcW w:type="dxa" w:w="6936"/>
-          </w:tcPr>
-          <w:p>
-            <w:pPr>
-              <w:pStyle w:val="Compact"/>
-              <w:spacing w:line="240" w:lineRule="auto" w:after="20"/>
-            </w:pPr>
-            <w:r>
-              <w:rPr>
-                <w:sz w:val="20"/>
-              </w:rPr>
-              <w:t xml:space="preserve">Table S31: two of five computable units exclude zero; the two-way estimators are undefined</w:t>
+            <w:tcW w:type="dxa" w:w="1137"/>
+          </w:tcPr>
+          <w:p>
+            <w:pPr>
+              <w:pStyle w:val="Compact"/>
+              <w:spacing w:line="240" w:lineRule="auto" w:after="20"/>
+            </w:pPr>
+            <w:r>
+              <w:rPr>
+                <w:sz w:val="20"/>
+              </w:rPr>
+              <w:t xml:space="preserve">Collar within-region increment</w:t>
+            </w:r>
+          </w:p>
+        </w:tc>
+        <w:tc>
+          <w:tcPr>
+            <w:tcW w:type="dxa" w:w="1432"/>
+          </w:tcPr>
+          <w:p>
+            <w:pPr>
+              <w:pStyle w:val="Compact"/>
+              <w:spacing w:line="240" w:lineRule="auto" w:after="20"/>
+            </w:pPr>
+            <w:r>
+              <w:rPr>
+                <w:sz w:val="20"/>
+              </w:rPr>
+              <w:t xml:space="preserve">Does the within-region increment survive the collar?</w:t>
+            </w:r>
+          </w:p>
+        </w:tc>
+        <w:tc>
+          <w:tcPr>
+            <w:tcW w:type="dxa" w:w="6501"/>
+          </w:tcPr>
+          <w:p>
+            <w:pPr>
+              <w:pStyle w:val="Compact"/>
+              <w:spacing w:line="240" w:lineRule="auto" w:after="20"/>
+            </w:pPr>
+            <w:r>
+              <w:rPr>
+                <w:sz w:val="20"/>
+              </w:rPr>
+              <w:t xml:space="preserve">+0.083 [+0.037, +0.129] over five regions (Student</w:t>
+            </w:r>
+            <w:r>
+              <w:rPr>
+                <w:sz w:val="20"/>
+              </w:rPr>
+              <w:t xml:space="preserve"> </w:t>
+            </w:r>
+            <w:r>
+              <w:rPr>
+                <w:i/>
+                <w:iCs/>
+                <w:sz w:val="20"/>
+              </w:rPr>
+              <w:t xml:space="preserve">t</w:t>
+            </w:r>
+            <w:r>
+              <w:rPr>
+                <w:sz w:val="20"/>
+              </w:rPr>
+              <w:t xml:space="preserve">), against +0.087 [+0.037, +0.136] as drawn</w:t>
             </w:r>
           </w:p>
         </w:tc>
@@ -22608,52 +22586,52 @@
         </w:trPr>
         <w:tc>
           <w:tcPr>
-            <w:tcW w:type="dxa" w:w="752"/>
-          </w:tcPr>
-          <w:p>
-            <w:pPr>
-              <w:pStyle w:val="Compact"/>
-              <w:spacing w:line="240" w:lineRule="auto" w:after="20"/>
-            </w:pPr>
-            <w:r>
-              <w:rPr>
-                <w:sz w:val="20"/>
-              </w:rPr>
-              <w:t xml:space="preserve">Equivalence of the equalised Δ</w:t>
-            </w:r>
-          </w:p>
-        </w:tc>
-        <w:tc>
-          <w:tcPr>
-            <w:tcW w:type="dxa" w:w="1382"/>
-          </w:tcPr>
-          <w:p>
-            <w:pPr>
-              <w:pStyle w:val="Compact"/>
-              <w:spacing w:line="240" w:lineRule="auto" w:after="20"/>
-            </w:pPr>
-            <w:r>
-              <w:rPr>
-                <w:sz w:val="20"/>
-              </w:rPr>
-              <w:t xml:space="preserve">How large a gain is excluded?</w:t>
-            </w:r>
-          </w:p>
-        </w:tc>
-        <w:tc>
-          <w:tcPr>
-            <w:tcW w:type="dxa" w:w="6936"/>
-          </w:tcPr>
-          <w:p>
-            <w:pPr>
-              <w:pStyle w:val="Compact"/>
-              <w:spacing w:line="240" w:lineRule="auto" w:after="20"/>
-            </w:pPr>
-            <w:r>
-              <w:rPr>
-                <w:sz w:val="20"/>
-              </w:rPr>
-              <w:t xml:space="preserve">Within ±0.05 under four of five units; no gain above 0.047 at 90 % (pair cluster); not within ±0.02 under any unit</w:t>
+            <w:tcW w:type="dxa" w:w="1137"/>
+          </w:tcPr>
+          <w:p>
+            <w:pPr>
+              <w:pStyle w:val="Compact"/>
+              <w:spacing w:line="240" w:lineRule="auto" w:after="20"/>
+            </w:pPr>
+            <w:r>
+              <w:rPr>
+                <w:sz w:val="20"/>
+              </w:rPr>
+              <w:t xml:space="preserve">Equalised Δ by resampling unit</w:t>
+            </w:r>
+          </w:p>
+        </w:tc>
+        <w:tc>
+          <w:tcPr>
+            <w:tcW w:type="dxa" w:w="1432"/>
+          </w:tcPr>
+          <w:p>
+            <w:pPr>
+              <w:pStyle w:val="Compact"/>
+              <w:spacing w:line="240" w:lineRule="auto" w:after="20"/>
+            </w:pPr>
+            <w:r>
+              <w:rPr>
+                <w:sz w:val="20"/>
+              </w:rPr>
+              <w:t xml:space="preserve">Does the collar Δ exclude zero?</w:t>
+            </w:r>
+          </w:p>
+        </w:tc>
+        <w:tc>
+          <w:tcPr>
+            <w:tcW w:type="dxa" w:w="6501"/>
+          </w:tcPr>
+          <w:p>
+            <w:pPr>
+              <w:pStyle w:val="Compact"/>
+              <w:spacing w:line="240" w:lineRule="auto" w:after="20"/>
+            </w:pPr>
+            <w:r>
+              <w:rPr>
+                <w:sz w:val="20"/>
+              </w:rPr>
+              <w:t xml:space="preserve">Table S31: two of six computable units exclude zero; the two-way estimators are undefined</w:t>
             </w:r>
           </w:p>
         </w:tc>
@@ -22664,52 +22642,52 @@
         </w:trPr>
         <w:tc>
           <w:tcPr>
-            <w:tcW w:type="dxa" w:w="752"/>
-          </w:tcPr>
-          <w:p>
-            <w:pPr>
-              <w:pStyle w:val="Compact"/>
-              <w:spacing w:line="240" w:lineRule="auto" w:after="20"/>
-            </w:pPr>
-            <w:r>
-              <w:rPr>
-                <w:sz w:val="20"/>
-              </w:rPr>
-              <w:t xml:space="preserve">Within minus transfer increment</w:t>
-            </w:r>
-          </w:p>
-        </w:tc>
-        <w:tc>
-          <w:tcPr>
-            <w:tcW w:type="dxa" w:w="1382"/>
-          </w:tcPr>
-          <w:p>
-            <w:pPr>
-              <w:pStyle w:val="Compact"/>
-              <w:spacing w:line="240" w:lineRule="auto" w:after="20"/>
-            </w:pPr>
-            <w:r>
-              <w:rPr>
-                <w:sz w:val="20"/>
-              </w:rPr>
-              <w:t xml:space="preserve">Is the local-versus-portable contrast itself supported?</w:t>
-            </w:r>
-          </w:p>
-        </w:tc>
-        <w:tc>
-          <w:tcPr>
-            <w:tcW w:type="dxa" w:w="6936"/>
-          </w:tcPr>
-          <w:p>
-            <w:pPr>
-              <w:pStyle w:val="Compact"/>
-              <w:spacing w:line="240" w:lineRule="auto" w:after="20"/>
-            </w:pPr>
-            <w:r>
-              <w:rPr>
-                <w:sz w:val="20"/>
-              </w:rPr>
-              <w:t xml:space="preserve">Full frame +0.079 [+0.014, +0.145]; 10 km collar +0.059 [+0.007, +0.110]; 5 km collar +0.026 [−0.012, +0.063]</w:t>
+            <w:tcW w:type="dxa" w:w="1137"/>
+          </w:tcPr>
+          <w:p>
+            <w:pPr>
+              <w:pStyle w:val="Compact"/>
+              <w:spacing w:line="240" w:lineRule="auto" w:after="20"/>
+            </w:pPr>
+            <w:r>
+              <w:rPr>
+                <w:sz w:val="20"/>
+              </w:rPr>
+              <w:t xml:space="preserve">Equivalence of the equalised Δ</w:t>
+            </w:r>
+          </w:p>
+        </w:tc>
+        <w:tc>
+          <w:tcPr>
+            <w:tcW w:type="dxa" w:w="1432"/>
+          </w:tcPr>
+          <w:p>
+            <w:pPr>
+              <w:pStyle w:val="Compact"/>
+              <w:spacing w:line="240" w:lineRule="auto" w:after="20"/>
+            </w:pPr>
+            <w:r>
+              <w:rPr>
+                <w:sz w:val="20"/>
+              </w:rPr>
+              <w:t xml:space="preserve">How large a gain is excluded?</w:t>
+            </w:r>
+          </w:p>
+        </w:tc>
+        <w:tc>
+          <w:tcPr>
+            <w:tcW w:type="dxa" w:w="6501"/>
+          </w:tcPr>
+          <w:p>
+            <w:pPr>
+              <w:pStyle w:val="Compact"/>
+              <w:spacing w:line="240" w:lineRule="auto" w:after="20"/>
+            </w:pPr>
+            <w:r>
+              <w:rPr>
+                <w:sz w:val="20"/>
+              </w:rPr>
+              <w:t xml:space="preserve">Within ±0.05 under four of five units; no gain above 0.047 at 90 % (pair cluster); not within ±0.02 under any unit</w:t>
             </w:r>
           </w:p>
         </w:tc>
@@ -22720,52 +22698,52 @@
         </w:trPr>
         <w:tc>
           <w:tcPr>
-            <w:tcW w:type="dxa" w:w="752"/>
-          </w:tcPr>
-          <w:p>
-            <w:pPr>
-              <w:pStyle w:val="Compact"/>
-              <w:spacing w:line="240" w:lineRule="auto" w:after="20"/>
-            </w:pPr>
-            <w:r>
-              <w:rPr>
-                <w:sz w:val="20"/>
-              </w:rPr>
-              <w:t xml:space="preserve">Reversal multiplicity</w:t>
-            </w:r>
-          </w:p>
-        </w:tc>
-        <w:tc>
-          <w:tcPr>
-            <w:tcW w:type="dxa" w:w="1382"/>
-          </w:tcPr>
-          <w:p>
-            <w:pPr>
-              <w:pStyle w:val="Compact"/>
-              <w:spacing w:line="240" w:lineRule="auto" w:after="20"/>
-            </w:pPr>
-            <w:r>
-              <w:rPr>
-                <w:sz w:val="20"/>
-              </w:rPr>
-              <w:t xml:space="preserve">Do the collar reversals survive correction?</w:t>
-            </w:r>
-          </w:p>
-        </w:tc>
-        <w:tc>
-          <w:tcPr>
-            <w:tcW w:type="dxa" w:w="6936"/>
-          </w:tcPr>
-          <w:p>
-            <w:pPr>
-              <w:pStyle w:val="Compact"/>
-              <w:spacing w:line="240" w:lineRule="auto" w:after="20"/>
-            </w:pPr>
-            <w:r>
-              <w:rPr>
-                <w:sz w:val="20"/>
-              </w:rPr>
-              <w:t xml:space="preserve">Table S30: two per-comparison reversals, none after Holm intersection-union</w:t>
+            <w:tcW w:type="dxa" w:w="1137"/>
+          </w:tcPr>
+          <w:p>
+            <w:pPr>
+              <w:pStyle w:val="Compact"/>
+              <w:spacing w:line="240" w:lineRule="auto" w:after="20"/>
+            </w:pPr>
+            <w:r>
+              <w:rPr>
+                <w:sz w:val="20"/>
+              </w:rPr>
+              <w:t xml:space="preserve">Within minus transfer increment</w:t>
+            </w:r>
+          </w:p>
+        </w:tc>
+        <w:tc>
+          <w:tcPr>
+            <w:tcW w:type="dxa" w:w="1432"/>
+          </w:tcPr>
+          <w:p>
+            <w:pPr>
+              <w:pStyle w:val="Compact"/>
+              <w:spacing w:line="240" w:lineRule="auto" w:after="20"/>
+            </w:pPr>
+            <w:r>
+              <w:rPr>
+                <w:sz w:val="20"/>
+              </w:rPr>
+              <w:t xml:space="preserve">Is the local-versus-portable contrast itself supported?</w:t>
+            </w:r>
+          </w:p>
+        </w:tc>
+        <w:tc>
+          <w:tcPr>
+            <w:tcW w:type="dxa" w:w="6501"/>
+          </w:tcPr>
+          <w:p>
+            <w:pPr>
+              <w:pStyle w:val="Compact"/>
+              <w:spacing w:line="240" w:lineRule="auto" w:after="20"/>
+            </w:pPr>
+            <w:r>
+              <w:rPr>
+                <w:sz w:val="20"/>
+              </w:rPr>
+              <w:t xml:space="preserve">Full frame +0.079 [+0.014, +0.145]; 10 km collar +0.059 [+0.007, +0.110]; 5 km collar +0.026 [−0.012, +0.063]</w:t>
             </w:r>
           </w:p>
         </w:tc>
@@ -22776,7 +22754,63 @@
         </w:trPr>
         <w:tc>
           <w:tcPr>
-            <w:tcW w:type="dxa" w:w="752"/>
+            <w:tcW w:type="dxa" w:w="1137"/>
+          </w:tcPr>
+          <w:p>
+            <w:pPr>
+              <w:pStyle w:val="Compact"/>
+              <w:spacing w:line="240" w:lineRule="auto" w:after="20"/>
+            </w:pPr>
+            <w:r>
+              <w:rPr>
+                <w:sz w:val="20"/>
+              </w:rPr>
+              <w:t xml:space="preserve">Reversal multiplicity</w:t>
+            </w:r>
+          </w:p>
+        </w:tc>
+        <w:tc>
+          <w:tcPr>
+            <w:tcW w:type="dxa" w:w="1432"/>
+          </w:tcPr>
+          <w:p>
+            <w:pPr>
+              <w:pStyle w:val="Compact"/>
+              <w:spacing w:line="240" w:lineRule="auto" w:after="20"/>
+            </w:pPr>
+            <w:r>
+              <w:rPr>
+                <w:sz w:val="20"/>
+              </w:rPr>
+              <w:t xml:space="preserve">Do the collar reversals survive correction?</w:t>
+            </w:r>
+          </w:p>
+        </w:tc>
+        <w:tc>
+          <w:tcPr>
+            <w:tcW w:type="dxa" w:w="6501"/>
+          </w:tcPr>
+          <w:p>
+            <w:pPr>
+              <w:pStyle w:val="Compact"/>
+              <w:spacing w:line="240" w:lineRule="auto" w:after="20"/>
+            </w:pPr>
+            <w:r>
+              <w:rPr>
+                <w:sz w:val="20"/>
+              </w:rPr>
+              <w:t xml:space="preserve">Table S30: two per-comparison reversals, none after Holm intersection-union</w:t>
+            </w:r>
+          </w:p>
+        </w:tc>
+      </w:tr>
+      <w:tr>
+        <w:trPr>
+          <w:cantSplit/>
+        </w:trPr>
+        <w:tc>
+          <w:tcPr>
+            <w:tcW w:type="dxa" w:w="1137"/>
           </w:tcPr>
           <w:p>
             <w:pPr>
@@ -22793,7 +22827,7 @@
         </w:tc>
         <w:tc>
           <w:tcPr>
-            <w:tcW w:type="dxa" w:w="1382"/>
+            <w:tcW w:type="dxa" w:w="1432"/>
           </w:tcPr>
           <w:p>
             <w:pPr>
@@ -22810,7 +22844,7 @@
         </w:tc>
         <w:tc>
           <w:tcPr>
-            <w:tcW w:type="dxa" w:w="6936"/>
+            <w:tcW w:type="dxa" w:w="6501"/>
           </w:tcPr>
           <w:p>
             <w:pPr>
@@ -41533,7 +41567,7 @@
         <w:t xml:space="preserve"> </w:t>
       </w:r>
       <w:r>
-        <w:t xml:space="preserve">results of Section S1.22, positive and negative, have this low power. With ten pairs, a moderate true</w:t>
+        <w:t xml:space="preserve">results of Section S1.21, positive and negative, have this low power. With ten pairs, a moderate true</w:t>
       </w:r>
       <w:r>
         <w:t xml:space="preserve"> </w:t>
@@ -42972,13 +43006,13 @@
         <w:t xml:space="preserve"> </w:t>
       </w:r>
       <w:r>
-        <w:t xml:space="preserve">clipped, with its interval from the same paired bootstrap. It is an upper limit on what a correction</w:t>
-      </w:r>
-      <w:r>
-        <w:t xml:space="preserve"> </w:t>
-      </w:r>
-      <w:r>
-        <w:t xml:space="preserve">of the predictor distributions can achieve. Section 4.3 shows that the remainder should not be read</w:t>
+        <w:t xml:space="preserve">clipped, with its interval from the same paired bootstrap. It describes what the two methods tested achieved, with the better one chosen using target labels;</w:t>
+      </w:r>
+      <w:r>
+        <w:t xml:space="preserve"> </w:t>
+      </w:r>
+      <w:r>
+        <w:t xml:space="preserve">other correction methods were not tested. Section 4.3 shows that the remainder should not be read</w:t>
       </w:r>
       <w:r>
         <w:t xml:space="preserve"> </w:t>
@@ -43162,13 +43196,13 @@
     </w:p>
     <w:bookmarkEnd w:id="62"/>
     <w:bookmarkEnd w:id="63"/>
-    <w:bookmarkStart w:id="64" w:name="X2ca07e7c22cf45b2abe8f9173657513d187df7a"/>
+    <w:bookmarkStart w:id="64" w:name="Xcdcaf2323eeae0176f0536c5eea1cbf922f6585"/>
     <w:p>
       <w:pPr>
         <w:pStyle w:val="Heading2"/>
       </w:pPr>
       <w:r>
-        <w:t xml:space="preserve">S3.8 Label-blind adaptation, full specification</w:t>
+        <w:t xml:space="preserve">S3.8 Label-free adaptation, full specification</w:t>
       </w:r>
     </w:p>
     <w:p>
@@ -44509,22 +44543,22 @@
     </w:p>
     <w:bookmarkEnd w:id="64"/>
     <w:bookmarkEnd w:id="65"/>
-    <w:bookmarkStart w:id="70" w:name="s5-target-label-recovery-curve"/>
+    <w:bookmarkStart w:id="70" w:name="s4-target-label-recovery-curve"/>
     <w:p>
       <w:pPr>
         <w:pStyle w:val="Heading1"/>
       </w:pPr>
       <w:r>
-        <w:t xml:space="preserve">S5 Target-label recovery curve</w:t>
+        <w:t xml:space="preserve">S4 Target-label recovery curve</w:t>
       </w:r>
     </w:p>
-    <w:bookmarkStart w:id="66" w:name="s5.1-purpose"/>
+    <w:bookmarkStart w:id="66" w:name="s4.1-purpose"/>
     <w:p>
       <w:pPr>
         <w:pStyle w:val="Heading2"/>
       </w:pPr>
       <w:r>
-        <w:t xml:space="preserve">S5.1 Purpose</w:t>
+        <w:t xml:space="preserve">S4.1 Purpose</w:t>
       </w:r>
     </w:p>
     <w:p>
@@ -44620,13 +44654,13 @@
       </w:r>
     </w:p>
     <w:bookmarkEnd w:id="66"/>
-    <w:bookmarkStart w:id="67" w:name="s5.2-design"/>
+    <w:bookmarkStart w:id="67" w:name="s4.2-design"/>
     <w:p>
       <w:pPr>
         <w:pStyle w:val="Heading2"/>
       </w:pPr>
       <w:r>
-        <w:t xml:space="preserve">S5.2 Design</w:t>
+        <w:t xml:space="preserve">S4.2 Design</w:t>
       </w:r>
     </w:p>
     <w:p>
@@ -44737,13 +44771,13 @@
       </w:r>
     </w:p>
     <w:bookmarkEnd w:id="67"/>
-    <w:bookmarkStart w:id="68" w:name="s5.3-result"/>
+    <w:bookmarkStart w:id="68" w:name="s4.3-result"/>
     <w:p>
       <w:pPr>
         <w:pStyle w:val="Heading2"/>
       </w:pPr>
       <w:r>
-        <w:t xml:space="preserve">S5.3 Result</w:t>
+        <w:t xml:space="preserve">S4.3 Result</w:t>
       </w:r>
     </w:p>
     <w:p>
@@ -46119,13 +46153,13 @@
       </w:r>
     </w:p>
     <w:bookmarkEnd w:id="68"/>
-    <w:bookmarkStart w:id="69" w:name="s5.4-limits"/>
+    <w:bookmarkStart w:id="69" w:name="s4.4-limits"/>
     <w:p>
       <w:pPr>
         <w:pStyle w:val="Heading2"/>
       </w:pPr>
       <w:r>
-        <w:t xml:space="preserve">S5.4 Limits</w:t>
+        <w:t xml:space="preserve">S4.4 Limits</w:t>
       </w:r>
     </w:p>
     <w:p>
@@ -46292,13 +46326,13 @@
     </w:p>
     <w:bookmarkEnd w:id="69"/>
     <w:bookmarkEnd w:id="70"/>
-    <w:bookmarkStart w:id="72" w:name="s6-code"/>
+    <w:bookmarkStart w:id="72" w:name="s5-code"/>
     <w:p>
       <w:pPr>
         <w:pStyle w:val="Heading1"/>
       </w:pPr>
       <w:r>
-        <w:t xml:space="preserve">S6 Code</w:t>
+        <w:t xml:space="preserve">S5 Code</w:t>
       </w:r>
     </w:p>
     <w:p>
@@ -46995,13 +47029,13 @@
       </w:r>
     </w:p>
     <w:bookmarkEnd w:id="72"/>
-    <w:bookmarkStart w:id="73" w:name="s7-data"/>
+    <w:bookmarkStart w:id="73" w:name="s6-data"/>
     <w:p>
       <w:pPr>
         <w:pStyle w:val="Heading1"/>
       </w:pPr>
       <w:r>
-        <w:t xml:space="preserve">S7 Data</w:t>
+        <w:t xml:space="preserve">S6 Data</w:t>
       </w:r>
     </w:p>
     <w:p>

</xml_diff>